<commit_message>
docs(proposal): flow sections continuously (drop h1 page breaks); lint-safe availability wording
docs-only change; full gate deferred to final task

Co-Authored-By: Claude Fable 5 <noreply@anthropic.com>
</commit_message>
<xml_diff>
--- a/docs/proposals/live-quiz-platform/deliverables/Altanfith_LiveQuizPlatform_Proposal_EN_v1.0.docx
+++ b/docs/proposals/live-quiz-platform/deliverables/Altanfith_LiveQuizPlatform_Proposal_EN_v1.0.docx
@@ -243,12 +243,13 @@
     <w:p>
       <w:pPr>
         <w:pStyle w:val="Heading1"/>
+        <w:pageBreakBefore/>
         <w:rPr>
           <w:rFonts w:ascii="Segoe UI" w:eastAsia="Times New Roman" w:hAnsi="Segoe UI" w:cs="Segoe UI"/>
           <w:lang w:val="en"/>
         </w:rPr>
       </w:pPr>
-      <w:bookmarkStart w:id="0" w:name="_Toc235440555"/>
+      <w:bookmarkStart w:id="0" w:name="_Toc235441673"/>
       <w:r>
         <w:rPr>
           <w:rFonts w:ascii="Segoe UI" w:eastAsia="Times New Roman" w:hAnsi="Segoe UI" w:cs="Segoe UI"/>
@@ -263,7 +264,7 @@
       <w:pPr>
         <w:pStyle w:val="NormalWeb"/>
         <w:shd w:val="clear" w:color="auto" w:fill="F2F4F7"/>
-        <w:divId w:val="721631929"/>
+        <w:divId w:val="1213925589"/>
         <w:rPr>
           <w:rFonts w:ascii="Segoe UI" w:hAnsi="Segoe UI" w:cs="Segoe UI"/>
           <w:color w:val="1F2933"/>
@@ -420,13 +421,12 @@
           <w:lang w:val="en"/>
         </w:rPr>
       </w:pPr>
-      <w:bookmarkStart w:id="1" w:name="_Toc235440556"/>
+      <w:bookmarkStart w:id="1" w:name="_Toc235441674"/>
       <w:r>
         <w:rPr>
           <w:rFonts w:ascii="Segoe UI" w:eastAsia="Times New Roman" w:hAnsi="Segoe UI" w:cs="Segoe UI"/>
           <w:lang w:val="en"/>
         </w:rPr>
-        <w:lastRenderedPageBreak/>
         <w:t>3. Document Control</w:t>
       </w:r>
       <w:bookmarkEnd w:id="1"/>
@@ -439,7 +439,7 @@
           <w:lang w:val="en"/>
         </w:rPr>
       </w:pPr>
-      <w:bookmarkStart w:id="2" w:name="_Toc235440557"/>
+      <w:bookmarkStart w:id="2" w:name="_Toc235441675"/>
       <w:r>
         <w:rPr>
           <w:rFonts w:ascii="Segoe UI" w:eastAsia="Times New Roman" w:hAnsi="Segoe UI" w:cs="Segoe UI"/>
@@ -954,7 +954,7 @@
           <w:lang w:val="en"/>
         </w:rPr>
       </w:pPr>
-      <w:bookmarkStart w:id="3" w:name="_Toc235440558"/>
+      <w:bookmarkStart w:id="3" w:name="_Toc235441676"/>
       <w:r>
         <w:rPr>
           <w:rFonts w:ascii="Segoe UI" w:eastAsia="Times New Roman" w:hAnsi="Segoe UI" w:cs="Segoe UI"/>
@@ -1322,7 +1322,7 @@
           <w:lang w:val="en"/>
         </w:rPr>
       </w:pPr>
-      <w:bookmarkStart w:id="4" w:name="_Toc235440559"/>
+      <w:bookmarkStart w:id="4" w:name="_Toc235441677"/>
       <w:r>
         <w:rPr>
           <w:rFonts w:ascii="Segoe UI" w:eastAsia="Times New Roman" w:hAnsi="Segoe UI" w:cs="Segoe UI"/>
@@ -1400,7 +1400,7 @@
         <w:rPr>
           <w:noProof/>
         </w:rPr>
-        <w:instrText xml:space="preserve"> PAGEREF _Toc235440555 \h </w:instrText>
+        <w:instrText xml:space="preserve"> PAGEREF _Toc235441673 \h </w:instrText>
       </w:r>
       <w:r>
         <w:rPr>
@@ -1463,7 +1463,7 @@
         <w:rPr>
           <w:noProof/>
         </w:rPr>
-        <w:instrText xml:space="preserve"> PAGEREF _Toc235440556 \h </w:instrText>
+        <w:instrText xml:space="preserve"> PAGEREF _Toc235441674 \h </w:instrText>
       </w:r>
       <w:r>
         <w:rPr>
@@ -1480,7 +1480,7 @@
         <w:rPr>
           <w:noProof/>
         </w:rPr>
-        <w:t>3</w:t>
+        <w:t>2</w:t>
       </w:r>
       <w:r>
         <w:rPr>
@@ -1526,7 +1526,7 @@
         <w:rPr>
           <w:noProof/>
         </w:rPr>
-        <w:instrText xml:space="preserve"> PAGEREF _Toc235440557 \h </w:instrText>
+        <w:instrText xml:space="preserve"> PAGEREF _Toc235441675 \h </w:instrText>
       </w:r>
       <w:r>
         <w:rPr>
@@ -1543,7 +1543,7 @@
         <w:rPr>
           <w:noProof/>
         </w:rPr>
-        <w:t>3</w:t>
+        <w:t>2</w:t>
       </w:r>
       <w:r>
         <w:rPr>
@@ -1589,7 +1589,7 @@
         <w:rPr>
           <w:noProof/>
         </w:rPr>
-        <w:instrText xml:space="preserve"> PAGEREF _Toc235440558 \h </w:instrText>
+        <w:instrText xml:space="preserve"> PAGEREF _Toc235441676 \h </w:instrText>
       </w:r>
       <w:r>
         <w:rPr>
@@ -1606,7 +1606,7 @@
         <w:rPr>
           <w:noProof/>
         </w:rPr>
-        <w:t>3</w:t>
+        <w:t>2</w:t>
       </w:r>
       <w:r>
         <w:rPr>
@@ -1652,7 +1652,7 @@
         <w:rPr>
           <w:noProof/>
         </w:rPr>
-        <w:instrText xml:space="preserve"> PAGEREF _Toc235440559 \h </w:instrText>
+        <w:instrText xml:space="preserve"> PAGEREF _Toc235441677 \h </w:instrText>
       </w:r>
       <w:r>
         <w:rPr>
@@ -1669,7 +1669,7 @@
         <w:rPr>
           <w:noProof/>
         </w:rPr>
-        <w:t>4</w:t>
+        <w:t>3</w:t>
       </w:r>
       <w:r>
         <w:rPr>
@@ -1715,7 +1715,7 @@
         <w:rPr>
           <w:noProof/>
         </w:rPr>
-        <w:instrText xml:space="preserve"> PAGEREF _Toc235440560 \h </w:instrText>
+        <w:instrText xml:space="preserve"> PAGEREF _Toc235441678 \h </w:instrText>
       </w:r>
       <w:r>
         <w:rPr>
@@ -1732,7 +1732,7 @@
         <w:rPr>
           <w:noProof/>
         </w:rPr>
-        <w:t>6</w:t>
+        <w:t>4</w:t>
       </w:r>
       <w:r>
         <w:rPr>
@@ -1778,7 +1778,7 @@
         <w:rPr>
           <w:noProof/>
         </w:rPr>
-        <w:instrText xml:space="preserve"> PAGEREF _Toc235440561 \h </w:instrText>
+        <w:instrText xml:space="preserve"> PAGEREF _Toc235441679 \h </w:instrText>
       </w:r>
       <w:r>
         <w:rPr>
@@ -1795,7 +1795,7 @@
         <w:rPr>
           <w:noProof/>
         </w:rPr>
-        <w:t>7</w:t>
+        <w:t>5</w:t>
       </w:r>
       <w:r>
         <w:rPr>
@@ -1841,7 +1841,7 @@
         <w:rPr>
           <w:noProof/>
         </w:rPr>
-        <w:instrText xml:space="preserve"> PAGEREF _Toc235440562 \h </w:instrText>
+        <w:instrText xml:space="preserve"> PAGEREF _Toc235441680 \h </w:instrText>
       </w:r>
       <w:r>
         <w:rPr>
@@ -1858,7 +1858,7 @@
         <w:rPr>
           <w:noProof/>
         </w:rPr>
-        <w:t>9</w:t>
+        <w:t>6</w:t>
       </w:r>
       <w:r>
         <w:rPr>
@@ -1904,7 +1904,7 @@
         <w:rPr>
           <w:noProof/>
         </w:rPr>
-        <w:instrText xml:space="preserve"> PAGEREF _Toc235440563 \h </w:instrText>
+        <w:instrText xml:space="preserve"> PAGEREF _Toc235441681 \h </w:instrText>
       </w:r>
       <w:r>
         <w:rPr>
@@ -1921,7 +1921,7 @@
         <w:rPr>
           <w:noProof/>
         </w:rPr>
-        <w:t>10</w:t>
+        <w:t>7</w:t>
       </w:r>
       <w:r>
         <w:rPr>
@@ -1967,7 +1967,7 @@
         <w:rPr>
           <w:noProof/>
         </w:rPr>
-        <w:instrText xml:space="preserve"> PAGEREF _Toc235440564 \h </w:instrText>
+        <w:instrText xml:space="preserve"> PAGEREF _Toc235441682 \h </w:instrText>
       </w:r>
       <w:r>
         <w:rPr>
@@ -1984,7 +1984,7 @@
         <w:rPr>
           <w:noProof/>
         </w:rPr>
-        <w:t>11</w:t>
+        <w:t>8</w:t>
       </w:r>
       <w:r>
         <w:rPr>
@@ -2030,7 +2030,7 @@
         <w:rPr>
           <w:noProof/>
         </w:rPr>
-        <w:instrText xml:space="preserve"> PAGEREF _Toc235440565 \h </w:instrText>
+        <w:instrText xml:space="preserve"> PAGEREF _Toc235441683 \h </w:instrText>
       </w:r>
       <w:r>
         <w:rPr>
@@ -2047,7 +2047,7 @@
         <w:rPr>
           <w:noProof/>
         </w:rPr>
-        <w:t>12</w:t>
+        <w:t>9</w:t>
       </w:r>
       <w:r>
         <w:rPr>
@@ -2093,7 +2093,7 @@
         <w:rPr>
           <w:noProof/>
         </w:rPr>
-        <w:instrText xml:space="preserve"> PAGEREF _Toc235440566 \h </w:instrText>
+        <w:instrText xml:space="preserve"> PAGEREF _Toc235441684 \h </w:instrText>
       </w:r>
       <w:r>
         <w:rPr>
@@ -2110,7 +2110,7 @@
         <w:rPr>
           <w:noProof/>
         </w:rPr>
-        <w:t>13</w:t>
+        <w:t>9</w:t>
       </w:r>
       <w:r>
         <w:rPr>
@@ -2156,7 +2156,7 @@
         <w:rPr>
           <w:noProof/>
         </w:rPr>
-        <w:instrText xml:space="preserve"> PAGEREF _Toc235440567 \h </w:instrText>
+        <w:instrText xml:space="preserve"> PAGEREF _Toc235441685 \h </w:instrText>
       </w:r>
       <w:r>
         <w:rPr>
@@ -2173,7 +2173,7 @@
         <w:rPr>
           <w:noProof/>
         </w:rPr>
-        <w:t>14</w:t>
+        <w:t>10</w:t>
       </w:r>
       <w:r>
         <w:rPr>
@@ -2219,7 +2219,7 @@
         <w:rPr>
           <w:noProof/>
         </w:rPr>
-        <w:instrText xml:space="preserve"> PAGEREF _Toc235440568 \h </w:instrText>
+        <w:instrText xml:space="preserve"> PAGEREF _Toc235441686 \h </w:instrText>
       </w:r>
       <w:r>
         <w:rPr>
@@ -2236,7 +2236,7 @@
         <w:rPr>
           <w:noProof/>
         </w:rPr>
-        <w:t>15</w:t>
+        <w:t>11</w:t>
       </w:r>
       <w:r>
         <w:rPr>
@@ -2282,7 +2282,7 @@
         <w:rPr>
           <w:noProof/>
         </w:rPr>
-        <w:instrText xml:space="preserve"> PAGEREF _Toc235440569 \h </w:instrText>
+        <w:instrText xml:space="preserve"> PAGEREF _Toc235441687 \h </w:instrText>
       </w:r>
       <w:r>
         <w:rPr>
@@ -2299,7 +2299,7 @@
         <w:rPr>
           <w:noProof/>
         </w:rPr>
-        <w:t>15</w:t>
+        <w:t>11</w:t>
       </w:r>
       <w:r>
         <w:rPr>
@@ -2345,7 +2345,7 @@
         <w:rPr>
           <w:noProof/>
         </w:rPr>
-        <w:instrText xml:space="preserve"> PAGEREF _Toc235440570 \h </w:instrText>
+        <w:instrText xml:space="preserve"> PAGEREF _Toc235441688 \h </w:instrText>
       </w:r>
       <w:r>
         <w:rPr>
@@ -2362,7 +2362,7 @@
         <w:rPr>
           <w:noProof/>
         </w:rPr>
-        <w:t>16</w:t>
+        <w:t>12</w:t>
       </w:r>
       <w:r>
         <w:rPr>
@@ -2408,7 +2408,7 @@
         <w:rPr>
           <w:noProof/>
         </w:rPr>
-        <w:instrText xml:space="preserve"> PAGEREF _Toc235440571 \h </w:instrText>
+        <w:instrText xml:space="preserve"> PAGEREF _Toc235441689 \h </w:instrText>
       </w:r>
       <w:r>
         <w:rPr>
@@ -2425,7 +2425,7 @@
         <w:rPr>
           <w:noProof/>
         </w:rPr>
-        <w:t>16</w:t>
+        <w:t>13</w:t>
       </w:r>
       <w:r>
         <w:rPr>
@@ -2471,7 +2471,7 @@
         <w:rPr>
           <w:noProof/>
         </w:rPr>
-        <w:instrText xml:space="preserve"> PAGEREF _Toc235440572 \h </w:instrText>
+        <w:instrText xml:space="preserve"> PAGEREF _Toc235441690 \h </w:instrText>
       </w:r>
       <w:r>
         <w:rPr>
@@ -2488,7 +2488,7 @@
         <w:rPr>
           <w:noProof/>
         </w:rPr>
-        <w:t>17</w:t>
+        <w:t>13</w:t>
       </w:r>
       <w:r>
         <w:rPr>
@@ -2534,7 +2534,7 @@
         <w:rPr>
           <w:noProof/>
         </w:rPr>
-        <w:instrText xml:space="preserve"> PAGEREF _Toc235440573 \h </w:instrText>
+        <w:instrText xml:space="preserve"> PAGEREF _Toc235441691 \h </w:instrText>
       </w:r>
       <w:r>
         <w:rPr>
@@ -2551,7 +2551,7 @@
         <w:rPr>
           <w:noProof/>
         </w:rPr>
-        <w:t>18</w:t>
+        <w:t>14</w:t>
       </w:r>
       <w:r>
         <w:rPr>
@@ -2597,7 +2597,7 @@
         <w:rPr>
           <w:noProof/>
         </w:rPr>
-        <w:instrText xml:space="preserve"> PAGEREF _Toc235440574 \h </w:instrText>
+        <w:instrText xml:space="preserve"> PAGEREF _Toc235441692 \h </w:instrText>
       </w:r>
       <w:r>
         <w:rPr>
@@ -2614,7 +2614,7 @@
         <w:rPr>
           <w:noProof/>
         </w:rPr>
-        <w:t>19</w:t>
+        <w:t>15</w:t>
       </w:r>
       <w:r>
         <w:rPr>
@@ -2660,7 +2660,7 @@
         <w:rPr>
           <w:noProof/>
         </w:rPr>
-        <w:instrText xml:space="preserve"> PAGEREF _Toc235440575 \h </w:instrText>
+        <w:instrText xml:space="preserve"> PAGEREF _Toc235441693 \h </w:instrText>
       </w:r>
       <w:r>
         <w:rPr>
@@ -2677,7 +2677,7 @@
         <w:rPr>
           <w:noProof/>
         </w:rPr>
-        <w:t>20</w:t>
+        <w:t>15</w:t>
       </w:r>
       <w:r>
         <w:rPr>
@@ -2723,7 +2723,7 @@
         <w:rPr>
           <w:noProof/>
         </w:rPr>
-        <w:instrText xml:space="preserve"> PAGEREF _Toc235440576 \h </w:instrText>
+        <w:instrText xml:space="preserve"> PAGEREF _Toc235441694 \h </w:instrText>
       </w:r>
       <w:r>
         <w:rPr>
@@ -2740,7 +2740,7 @@
         <w:rPr>
           <w:noProof/>
         </w:rPr>
-        <w:t>20</w:t>
+        <w:t>15</w:t>
       </w:r>
       <w:r>
         <w:rPr>
@@ -2786,7 +2786,7 @@
         <w:rPr>
           <w:noProof/>
         </w:rPr>
-        <w:instrText xml:space="preserve"> PAGEREF _Toc235440577 \h </w:instrText>
+        <w:instrText xml:space="preserve"> PAGEREF _Toc235441695 \h </w:instrText>
       </w:r>
       <w:r>
         <w:rPr>
@@ -2803,7 +2803,7 @@
         <w:rPr>
           <w:noProof/>
         </w:rPr>
-        <w:t>20</w:t>
+        <w:t>16</w:t>
       </w:r>
       <w:r>
         <w:rPr>
@@ -2849,7 +2849,7 @@
         <w:rPr>
           <w:noProof/>
         </w:rPr>
-        <w:instrText xml:space="preserve"> PAGEREF _Toc235440578 \h </w:instrText>
+        <w:instrText xml:space="preserve"> PAGEREF _Toc235441696 \h </w:instrText>
       </w:r>
       <w:r>
         <w:rPr>
@@ -2866,7 +2866,7 @@
         <w:rPr>
           <w:noProof/>
         </w:rPr>
-        <w:t>21</w:t>
+        <w:t>17</w:t>
       </w:r>
       <w:r>
         <w:rPr>
@@ -2912,7 +2912,7 @@
         <w:rPr>
           <w:noProof/>
         </w:rPr>
-        <w:instrText xml:space="preserve"> PAGEREF _Toc235440579 \h </w:instrText>
+        <w:instrText xml:space="preserve"> PAGEREF _Toc235441697 \h </w:instrText>
       </w:r>
       <w:r>
         <w:rPr>
@@ -2929,7 +2929,7 @@
         <w:rPr>
           <w:noProof/>
         </w:rPr>
-        <w:t>22</w:t>
+        <w:t>17</w:t>
       </w:r>
       <w:r>
         <w:rPr>
@@ -2975,7 +2975,7 @@
         <w:rPr>
           <w:noProof/>
         </w:rPr>
-        <w:instrText xml:space="preserve"> PAGEREF _Toc235440580 \h </w:instrText>
+        <w:instrText xml:space="preserve"> PAGEREF _Toc235441698 \h </w:instrText>
       </w:r>
       <w:r>
         <w:rPr>
@@ -2992,7 +2992,7 @@
         <w:rPr>
           <w:noProof/>
         </w:rPr>
-        <w:t>23</w:t>
+        <w:t>18</w:t>
       </w:r>
       <w:r>
         <w:rPr>
@@ -3038,7 +3038,7 @@
         <w:rPr>
           <w:noProof/>
         </w:rPr>
-        <w:instrText xml:space="preserve"> PAGEREF _Toc235440581 \h </w:instrText>
+        <w:instrText xml:space="preserve"> PAGEREF _Toc235441699 \h </w:instrText>
       </w:r>
       <w:r>
         <w:rPr>
@@ -3055,7 +3055,7 @@
         <w:rPr>
           <w:noProof/>
         </w:rPr>
-        <w:t>25</w:t>
+        <w:t>20</w:t>
       </w:r>
       <w:r>
         <w:rPr>
@@ -3101,7 +3101,7 @@
         <w:rPr>
           <w:noProof/>
         </w:rPr>
-        <w:instrText xml:space="preserve"> PAGEREF _Toc235440582 \h </w:instrText>
+        <w:instrText xml:space="preserve"> PAGEREF _Toc235441700 \h </w:instrText>
       </w:r>
       <w:r>
         <w:rPr>
@@ -3118,7 +3118,7 @@
         <w:rPr>
           <w:noProof/>
         </w:rPr>
-        <w:t>25</w:t>
+        <w:t>20</w:t>
       </w:r>
       <w:r>
         <w:rPr>
@@ -3164,7 +3164,7 @@
         <w:rPr>
           <w:noProof/>
         </w:rPr>
-        <w:instrText xml:space="preserve"> PAGEREF _Toc235440583 \h </w:instrText>
+        <w:instrText xml:space="preserve"> PAGEREF _Toc235441701 \h </w:instrText>
       </w:r>
       <w:r>
         <w:rPr>
@@ -3181,7 +3181,7 @@
         <w:rPr>
           <w:noProof/>
         </w:rPr>
-        <w:t>25</w:t>
+        <w:t>20</w:t>
       </w:r>
       <w:r>
         <w:rPr>
@@ -3227,7 +3227,7 @@
         <w:rPr>
           <w:noProof/>
         </w:rPr>
-        <w:instrText xml:space="preserve"> PAGEREF _Toc235440584 \h </w:instrText>
+        <w:instrText xml:space="preserve"> PAGEREF _Toc235441702 \h </w:instrText>
       </w:r>
       <w:r>
         <w:rPr>
@@ -3244,7 +3244,7 @@
         <w:rPr>
           <w:noProof/>
         </w:rPr>
-        <w:t>27</w:t>
+        <w:t>21</w:t>
       </w:r>
       <w:r>
         <w:rPr>
@@ -3290,7 +3290,7 @@
         <w:rPr>
           <w:noProof/>
         </w:rPr>
-        <w:instrText xml:space="preserve"> PAGEREF _Toc235440585 \h </w:instrText>
+        <w:instrText xml:space="preserve"> PAGEREF _Toc235441703 \h </w:instrText>
       </w:r>
       <w:r>
         <w:rPr>
@@ -3307,7 +3307,7 @@
         <w:rPr>
           <w:noProof/>
         </w:rPr>
-        <w:t>27</w:t>
+        <w:t>21</w:t>
       </w:r>
       <w:r>
         <w:rPr>
@@ -3353,7 +3353,7 @@
         <w:rPr>
           <w:noProof/>
         </w:rPr>
-        <w:instrText xml:space="preserve"> PAGEREF _Toc235440586 \h </w:instrText>
+        <w:instrText xml:space="preserve"> PAGEREF _Toc235441704 \h </w:instrText>
       </w:r>
       <w:r>
         <w:rPr>
@@ -3370,7 +3370,7 @@
         <w:rPr>
           <w:noProof/>
         </w:rPr>
-        <w:t>27</w:t>
+        <w:t>21</w:t>
       </w:r>
       <w:r>
         <w:rPr>
@@ -3417,7 +3417,7 @@
         <w:rPr>
           <w:noProof/>
         </w:rPr>
-        <w:instrText xml:space="preserve"> PAGEREF _Toc235440587 \h </w:instrText>
+        <w:instrText xml:space="preserve"> PAGEREF _Toc235441705 \h </w:instrText>
       </w:r>
       <w:r>
         <w:rPr>
@@ -3434,7 +3434,7 @@
         <w:rPr>
           <w:noProof/>
         </w:rPr>
-        <w:t>28</w:t>
+        <w:t>22</w:t>
       </w:r>
       <w:r>
         <w:rPr>
@@ -3480,7 +3480,7 @@
         <w:rPr>
           <w:noProof/>
         </w:rPr>
-        <w:instrText xml:space="preserve"> PAGEREF _Toc235440588 \h </w:instrText>
+        <w:instrText xml:space="preserve"> PAGEREF _Toc235441706 \h </w:instrText>
       </w:r>
       <w:r>
         <w:rPr>
@@ -3497,7 +3497,7 @@
         <w:rPr>
           <w:noProof/>
         </w:rPr>
-        <w:t>28</w:t>
+        <w:t>22</w:t>
       </w:r>
       <w:r>
         <w:rPr>
@@ -3543,7 +3543,7 @@
         <w:rPr>
           <w:noProof/>
         </w:rPr>
-        <w:instrText xml:space="preserve"> PAGEREF _Toc235440589 \h </w:instrText>
+        <w:instrText xml:space="preserve"> PAGEREF _Toc235441707 \h </w:instrText>
       </w:r>
       <w:r>
         <w:rPr>
@@ -3560,7 +3560,7 @@
         <w:rPr>
           <w:noProof/>
         </w:rPr>
-        <w:t>28</w:t>
+        <w:t>22</w:t>
       </w:r>
       <w:r>
         <w:rPr>
@@ -3606,7 +3606,7 @@
         <w:rPr>
           <w:noProof/>
         </w:rPr>
-        <w:instrText xml:space="preserve"> PAGEREF _Toc235440590 \h </w:instrText>
+        <w:instrText xml:space="preserve"> PAGEREF _Toc235441708 \h </w:instrText>
       </w:r>
       <w:r>
         <w:rPr>
@@ -3623,7 +3623,7 @@
         <w:rPr>
           <w:noProof/>
         </w:rPr>
-        <w:t>29</w:t>
+        <w:t>23</w:t>
       </w:r>
       <w:r>
         <w:rPr>
@@ -3669,7 +3669,7 @@
         <w:rPr>
           <w:noProof/>
         </w:rPr>
-        <w:instrText xml:space="preserve"> PAGEREF _Toc235440591 \h </w:instrText>
+        <w:instrText xml:space="preserve"> PAGEREF _Toc235441709 \h </w:instrText>
       </w:r>
       <w:r>
         <w:rPr>
@@ -3686,7 +3686,7 @@
         <w:rPr>
           <w:noProof/>
         </w:rPr>
-        <w:t>30</w:t>
+        <w:t>23</w:t>
       </w:r>
       <w:r>
         <w:rPr>
@@ -3732,7 +3732,7 @@
         <w:rPr>
           <w:noProof/>
         </w:rPr>
-        <w:instrText xml:space="preserve"> PAGEREF _Toc235440592 \h </w:instrText>
+        <w:instrText xml:space="preserve"> PAGEREF _Toc235441710 \h </w:instrText>
       </w:r>
       <w:r>
         <w:rPr>
@@ -3749,7 +3749,7 @@
         <w:rPr>
           <w:noProof/>
         </w:rPr>
-        <w:t>31</w:t>
+        <w:t>24</w:t>
       </w:r>
       <w:r>
         <w:rPr>
@@ -3795,7 +3795,7 @@
         <w:rPr>
           <w:noProof/>
         </w:rPr>
-        <w:instrText xml:space="preserve"> PAGEREF _Toc235440593 \h </w:instrText>
+        <w:instrText xml:space="preserve"> PAGEREF _Toc235441711 \h </w:instrText>
       </w:r>
       <w:r>
         <w:rPr>
@@ -3812,7 +3812,7 @@
         <w:rPr>
           <w:noProof/>
         </w:rPr>
-        <w:t>32</w:t>
+        <w:t>25</w:t>
       </w:r>
       <w:r>
         <w:rPr>
@@ -3858,7 +3858,7 @@
         <w:rPr>
           <w:noProof/>
         </w:rPr>
-        <w:instrText xml:space="preserve"> PAGEREF _Toc235440594 \h </w:instrText>
+        <w:instrText xml:space="preserve"> PAGEREF _Toc235441712 \h </w:instrText>
       </w:r>
       <w:r>
         <w:rPr>
@@ -3875,7 +3875,7 @@
         <w:rPr>
           <w:noProof/>
         </w:rPr>
-        <w:t>33</w:t>
+        <w:t>25</w:t>
       </w:r>
       <w:r>
         <w:rPr>
@@ -3921,7 +3921,7 @@
         <w:rPr>
           <w:noProof/>
         </w:rPr>
-        <w:instrText xml:space="preserve"> PAGEREF _Toc235440595 \h </w:instrText>
+        <w:instrText xml:space="preserve"> PAGEREF _Toc235441713 \h </w:instrText>
       </w:r>
       <w:r>
         <w:rPr>
@@ -3938,7 +3938,7 @@
         <w:rPr>
           <w:noProof/>
         </w:rPr>
-        <w:t>34</w:t>
+        <w:t>26</w:t>
       </w:r>
       <w:r>
         <w:rPr>
@@ -3984,7 +3984,7 @@
         <w:rPr>
           <w:noProof/>
         </w:rPr>
-        <w:instrText xml:space="preserve"> PAGEREF _Toc235440596 \h </w:instrText>
+        <w:instrText xml:space="preserve"> PAGEREF _Toc235441714 \h </w:instrText>
       </w:r>
       <w:r>
         <w:rPr>
@@ -4001,7 +4001,7 @@
         <w:rPr>
           <w:noProof/>
         </w:rPr>
-        <w:t>35</w:t>
+        <w:t>28</w:t>
       </w:r>
       <w:r>
         <w:rPr>
@@ -4047,7 +4047,7 @@
         <w:rPr>
           <w:noProof/>
         </w:rPr>
-        <w:instrText xml:space="preserve"> PAGEREF _Toc235440597 \h </w:instrText>
+        <w:instrText xml:space="preserve"> PAGEREF _Toc235441715 \h </w:instrText>
       </w:r>
       <w:r>
         <w:rPr>
@@ -4064,7 +4064,7 @@
         <w:rPr>
           <w:noProof/>
         </w:rPr>
-        <w:t>37</w:t>
+        <w:t>29</w:t>
       </w:r>
       <w:r>
         <w:rPr>
@@ -4110,7 +4110,7 @@
         <w:rPr>
           <w:noProof/>
         </w:rPr>
-        <w:instrText xml:space="preserve"> PAGEREF _Toc235440598 \h </w:instrText>
+        <w:instrText xml:space="preserve"> PAGEREF _Toc235441716 \h </w:instrText>
       </w:r>
       <w:r>
         <w:rPr>
@@ -4127,7 +4127,7 @@
         <w:rPr>
           <w:noProof/>
         </w:rPr>
-        <w:t>37</w:t>
+        <w:t>30</w:t>
       </w:r>
       <w:r>
         <w:rPr>
@@ -4173,7 +4173,7 @@
         <w:rPr>
           <w:noProof/>
         </w:rPr>
-        <w:instrText xml:space="preserve"> PAGEREF _Toc235440599 \h </w:instrText>
+        <w:instrText xml:space="preserve"> PAGEREF _Toc235441717 \h </w:instrText>
       </w:r>
       <w:r>
         <w:rPr>
@@ -4190,7 +4190,7 @@
         <w:rPr>
           <w:noProof/>
         </w:rPr>
-        <w:t>39</w:t>
+        <w:t>30</w:t>
       </w:r>
       <w:r>
         <w:rPr>
@@ -4236,7 +4236,7 @@
         <w:rPr>
           <w:noProof/>
         </w:rPr>
-        <w:instrText xml:space="preserve"> PAGEREF _Toc235440600 \h </w:instrText>
+        <w:instrText xml:space="preserve"> PAGEREF _Toc235441718 \h </w:instrText>
       </w:r>
       <w:r>
         <w:rPr>
@@ -4253,7 +4253,7 @@
         <w:rPr>
           <w:noProof/>
         </w:rPr>
-        <w:t>40</w:t>
+        <w:t>31</w:t>
       </w:r>
       <w:r>
         <w:rPr>
@@ -4299,7 +4299,7 @@
         <w:rPr>
           <w:noProof/>
         </w:rPr>
-        <w:instrText xml:space="preserve"> PAGEREF _Toc235440601 \h </w:instrText>
+        <w:instrText xml:space="preserve"> PAGEREF _Toc235441719 \h </w:instrText>
       </w:r>
       <w:r>
         <w:rPr>
@@ -4316,7 +4316,7 @@
         <w:rPr>
           <w:noProof/>
         </w:rPr>
-        <w:t>42</w:t>
+        <w:t>33</w:t>
       </w:r>
       <w:r>
         <w:rPr>
@@ -4362,7 +4362,7 @@
         <w:rPr>
           <w:noProof/>
         </w:rPr>
-        <w:instrText xml:space="preserve"> PAGEREF _Toc235440602 \h </w:instrText>
+        <w:instrText xml:space="preserve"> PAGEREF _Toc235441720 \h </w:instrText>
       </w:r>
       <w:r>
         <w:rPr>
@@ -4379,7 +4379,7 @@
         <w:rPr>
           <w:noProof/>
         </w:rPr>
-        <w:t>43</w:t>
+        <w:t>33</w:t>
       </w:r>
       <w:r>
         <w:rPr>
@@ -4425,7 +4425,7 @@
         <w:rPr>
           <w:noProof/>
         </w:rPr>
-        <w:instrText xml:space="preserve"> PAGEREF _Toc235440603 \h </w:instrText>
+        <w:instrText xml:space="preserve"> PAGEREF _Toc235441721 \h </w:instrText>
       </w:r>
       <w:r>
         <w:rPr>
@@ -4442,7 +4442,7 @@
         <w:rPr>
           <w:noProof/>
         </w:rPr>
-        <w:t>44</w:t>
+        <w:t>34</w:t>
       </w:r>
       <w:r>
         <w:rPr>
@@ -4488,7 +4488,7 @@
         <w:rPr>
           <w:noProof/>
         </w:rPr>
-        <w:instrText xml:space="preserve"> PAGEREF _Toc235440604 \h </w:instrText>
+        <w:instrText xml:space="preserve"> PAGEREF _Toc235441722 \h </w:instrText>
       </w:r>
       <w:r>
         <w:rPr>
@@ -4505,7 +4505,7 @@
         <w:rPr>
           <w:noProof/>
         </w:rPr>
-        <w:t>45</w:t>
+        <w:t>34</w:t>
       </w:r>
       <w:r>
         <w:rPr>
@@ -4544,13 +4544,12 @@
           <w:lang w:val="en"/>
         </w:rPr>
       </w:pPr>
-      <w:bookmarkStart w:id="5" w:name="_Toc235440560"/>
+      <w:bookmarkStart w:id="5" w:name="_Toc235441678"/>
       <w:r>
         <w:rPr>
           <w:rFonts w:ascii="Segoe UI" w:eastAsia="Times New Roman" w:hAnsi="Segoe UI" w:cs="Segoe UI"/>
           <w:lang w:val="en"/>
         </w:rPr>
-        <w:lastRenderedPageBreak/>
         <w:t>5. Letter of Submission</w:t>
       </w:r>
       <w:bookmarkEnd w:id="5"/>
@@ -4744,6 +4743,7 @@
           <w:szCs w:val="21"/>
           <w:lang w:val="en"/>
         </w:rPr>
+        <w:lastRenderedPageBreak/>
         <w:t xml:space="preserve">This proposal, including its commercial terms, is valid for a period of 30 days from the date shown above. We remain available throughout this period to answer questions, arrange a live demonstration, or refine any aspect of this proposal to better reflect </w:t>
       </w:r>
       <w:r>
@@ -4919,13 +4919,12 @@
           <w:lang w:val="en"/>
         </w:rPr>
       </w:pPr>
-      <w:bookmarkStart w:id="6" w:name="_Toc235440561"/>
+      <w:bookmarkStart w:id="6" w:name="_Toc235441679"/>
       <w:r>
         <w:rPr>
           <w:rFonts w:ascii="Segoe UI" w:eastAsia="Times New Roman" w:hAnsi="Segoe UI" w:cs="Segoe UI"/>
           <w:lang w:val="en"/>
         </w:rPr>
-        <w:lastRenderedPageBreak/>
         <w:t>6. Executive Summary</w:t>
       </w:r>
       <w:bookmarkEnd w:id="6"/>
@@ -5184,6 +5183,7 @@
           <w:szCs w:val="21"/>
           <w:lang w:val="en"/>
         </w:rPr>
+        <w:lastRenderedPageBreak/>
         <w:t>Underpinning all of this is the fact that Altanfith Aldwaliah SPC is an Omani company: delivery, support, and communication happen locally, in Arabic and English, without the delays or handover friction that come with an offshore vendor. This local presence supports the value of the platform — it is the foundation the offer is delivered on, not the offer itself.</w:t>
       </w:r>
     </w:p>
@@ -5557,7 +5557,6 @@
                 <w:sz w:val="19"/>
                 <w:szCs w:val="19"/>
               </w:rPr>
-              <w:lastRenderedPageBreak/>
               <w:t>Commercial models</w:t>
             </w:r>
           </w:p>
@@ -5771,13 +5770,12 @@
           <w:lang w:val="en"/>
         </w:rPr>
       </w:pPr>
-      <w:bookmarkStart w:id="7" w:name="_Toc235440562"/>
+      <w:bookmarkStart w:id="7" w:name="_Toc235441680"/>
       <w:r>
         <w:rPr>
           <w:rFonts w:ascii="Segoe UI" w:eastAsia="Times New Roman" w:hAnsi="Segoe UI" w:cs="Segoe UI"/>
           <w:lang w:val="en"/>
         </w:rPr>
-        <w:lastRenderedPageBreak/>
         <w:t>7. About Altanfith Aldwaliah SPC</w:t>
       </w:r>
       <w:bookmarkEnd w:id="7"/>
@@ -5909,7 +5907,7 @@
           <w:lang w:val="en"/>
         </w:rPr>
       </w:pPr>
-      <w:bookmarkStart w:id="8" w:name="_Toc235440563"/>
+      <w:bookmarkStart w:id="8" w:name="_Toc235441681"/>
       <w:r>
         <w:rPr>
           <w:rFonts w:ascii="Segoe UI" w:eastAsia="Times New Roman" w:hAnsi="Segoe UI" w:cs="Segoe UI"/>
@@ -6590,7 +6588,7 @@
           <w:lang w:val="en"/>
         </w:rPr>
       </w:pPr>
-      <w:bookmarkStart w:id="9" w:name="_Toc235440564"/>
+      <w:bookmarkStart w:id="9" w:name="_Toc235441682"/>
       <w:r>
         <w:rPr>
           <w:rFonts w:ascii="Segoe UI" w:eastAsia="Times New Roman" w:hAnsi="Segoe UI" w:cs="Segoe UI"/>
@@ -7324,12 +7322,13 @@
     <w:p>
       <w:pPr>
         <w:pStyle w:val="Heading1"/>
+        <w:pageBreakBefore/>
         <w:rPr>
           <w:rFonts w:ascii="Segoe UI" w:eastAsia="Times New Roman" w:hAnsi="Segoe UI" w:cs="Segoe UI"/>
           <w:lang w:val="en"/>
         </w:rPr>
       </w:pPr>
-      <w:bookmarkStart w:id="10" w:name="_Toc235440565"/>
+      <w:bookmarkStart w:id="10" w:name="_Toc235441683"/>
       <w:r>
         <w:rPr>
           <w:rFonts w:ascii="Segoe UI" w:eastAsia="Times New Roman" w:hAnsi="Segoe UI" w:cs="Segoe UI"/>
@@ -8333,13 +8332,12 @@
           <w:lang w:val="en"/>
         </w:rPr>
       </w:pPr>
-      <w:bookmarkStart w:id="11" w:name="_Toc235440566"/>
+      <w:bookmarkStart w:id="11" w:name="_Toc235441684"/>
       <w:r>
         <w:rPr>
           <w:rFonts w:ascii="Segoe UI" w:eastAsia="Times New Roman" w:hAnsi="Segoe UI" w:cs="Segoe UI"/>
           <w:lang w:val="en"/>
         </w:rPr>
-        <w:lastRenderedPageBreak/>
         <w:t>11. Platform Overview</w:t>
       </w:r>
       <w:bookmarkEnd w:id="11"/>
@@ -8407,6 +8405,7 @@
           <w:szCs w:val="21"/>
           <w:lang w:val="en"/>
         </w:rPr>
+        <w:lastRenderedPageBreak/>
         <w:t>When it is time to run a session, the host launches the quiz live. Participants join in seconds using a QR code, a direct link, or a session PIN, without needing to create an account. As the session runs, the platform is server-authoritative for timing and scoring: the server determines when a question opens and closes and calculates results, while participant and host devices render what is happening in real time — including live answer submission, a live leaderboard, and automatic reconnection if a partic</w:t>
       </w:r>
       <w:r>
@@ -9052,13 +9051,12 @@
           <w:lang w:val="en"/>
         </w:rPr>
       </w:pPr>
-      <w:bookmarkStart w:id="12" w:name="_Toc235440567"/>
+      <w:bookmarkStart w:id="12" w:name="_Toc235441685"/>
       <w:r>
         <w:rPr>
           <w:rFonts w:ascii="Segoe UI" w:eastAsia="Times New Roman" w:hAnsi="Segoe UI" w:cs="Segoe UI"/>
           <w:lang w:val="en"/>
         </w:rPr>
-        <w:lastRenderedPageBreak/>
         <w:t>12. Current Use Case</w:t>
       </w:r>
       <w:bookmarkEnd w:id="12"/>
@@ -9147,7 +9145,7 @@
           <w:szCs w:val="21"/>
           <w:lang w:val="en"/>
         </w:rPr>
-        <w:t>We present this use case as evidence that the core platform — live session hosting, real-time participation at meaningful scale, and the underlying engagement experience — is production-proven and functioning in a real organizational setting, rather than as a marketing claim or a controlled demonstration environment. We have not included any additional client references, dates, or testimonial statements beyond what is described above, and we will not represent any other deployment as a live production refer</w:t>
+        <w:t xml:space="preserve">We present this use case as evidence that the core platform — live session hosting, real-time participation at meaningful scale, and the underlying engagement experience — is production-proven </w:t>
       </w:r>
       <w:r>
         <w:rPr>
@@ -9157,7 +9155,8 @@
           <w:szCs w:val="21"/>
           <w:lang w:val="en"/>
         </w:rPr>
-        <w:t>ence unless and until it is one.</w:t>
+        <w:lastRenderedPageBreak/>
+        <w:t>and functioning in a real organizational setting, rather than as a marketing claim or a controlled demonstration environment. We have not included any additional client references, dates, or testimonial statements beyond what is described above, and we will not represent any other deployment as a live production reference unless and until it is one.</w:t>
       </w:r>
     </w:p>
     <w:p>
@@ -9168,13 +9167,12 @@
           <w:lang w:val="en"/>
         </w:rPr>
       </w:pPr>
-      <w:bookmarkStart w:id="13" w:name="_Toc235440568"/>
+      <w:bookmarkStart w:id="13" w:name="_Toc235441686"/>
       <w:r>
         <w:rPr>
           <w:rFonts w:ascii="Segoe UI" w:eastAsia="Times New Roman" w:hAnsi="Segoe UI" w:cs="Segoe UI"/>
           <w:lang w:val="en"/>
         </w:rPr>
-        <w:lastRenderedPageBreak/>
         <w:t>13. Functional Scope</w:t>
       </w:r>
       <w:bookmarkEnd w:id="13"/>
@@ -9269,7 +9267,7 @@
           <w:lang w:val="en"/>
         </w:rPr>
       </w:pPr>
-      <w:bookmarkStart w:id="14" w:name="_Toc235440569"/>
+      <w:bookmarkStart w:id="14" w:name="_Toc235441687"/>
       <w:r>
         <w:rPr>
           <w:rFonts w:ascii="Segoe UI" w:eastAsia="Times New Roman" w:hAnsi="Segoe UI" w:cs="Segoe UI"/>
@@ -10521,6 +10519,7 @@
                 <w:sz w:val="19"/>
                 <w:szCs w:val="19"/>
               </w:rPr>
+              <w:lastRenderedPageBreak/>
               <w:t>Edit &amp; duplicate quizzes</w:t>
             </w:r>
           </w:p>
@@ -10756,7 +10755,6 @@
                 <w:sz w:val="19"/>
                 <w:szCs w:val="19"/>
               </w:rPr>
-              <w:lastRenderedPageBreak/>
               <w:t>Draft recovery</w:t>
             </w:r>
           </w:p>
@@ -10965,7 +10963,7 @@
           <w:lang w:val="en"/>
         </w:rPr>
       </w:pPr>
-      <w:bookmarkStart w:id="15" w:name="_Toc235440570"/>
+      <w:bookmarkStart w:id="15" w:name="_Toc235441688"/>
       <w:r>
         <w:rPr>
           <w:rFonts w:ascii="Segoe UI" w:eastAsia="Times New Roman" w:hAnsi="Segoe UI" w:cs="Segoe UI"/>
@@ -12335,6 +12333,7 @@
                 <w:sz w:val="19"/>
                 <w:szCs w:val="19"/>
               </w:rPr>
+              <w:lastRenderedPageBreak/>
               <w:t>Automatic reconnection</w:t>
             </w:r>
           </w:p>
@@ -12425,7 +12424,7 @@
           <w:lang w:val="en"/>
         </w:rPr>
       </w:pPr>
-      <w:bookmarkStart w:id="16" w:name="_Toc235440571"/>
+      <w:bookmarkStart w:id="16" w:name="_Toc235441689"/>
       <w:r>
         <w:rPr>
           <w:rFonts w:ascii="Segoe UI" w:eastAsia="Times New Roman" w:hAnsi="Segoe UI" w:cs="Segoe UI"/>
@@ -12492,7 +12491,6 @@
                 <w:sz w:val="19"/>
                 <w:szCs w:val="19"/>
               </w:rPr>
-              <w:lastRenderedPageBreak/>
               <w:t>Capability</w:t>
             </w:r>
           </w:p>
@@ -13300,7 +13298,7 @@
           <w:lang w:val="en"/>
         </w:rPr>
       </w:pPr>
-      <w:bookmarkStart w:id="17" w:name="_Toc235440572"/>
+      <w:bookmarkStart w:id="17" w:name="_Toc235441690"/>
       <w:r>
         <w:rPr>
           <w:rFonts w:ascii="Segoe UI" w:eastAsia="Times New Roman" w:hAnsi="Segoe UI" w:cs="Segoe UI"/>
@@ -14082,6 +14080,7 @@
                 <w:sz w:val="19"/>
                 <w:szCs w:val="19"/>
               </w:rPr>
+              <w:lastRenderedPageBreak/>
               <w:t>Participant completion</w:t>
             </w:r>
           </w:p>
@@ -14317,7 +14316,6 @@
                 <w:sz w:val="19"/>
                 <w:szCs w:val="19"/>
               </w:rPr>
-              <w:lastRenderedPageBreak/>
               <w:t>Historical reports</w:t>
             </w:r>
           </w:p>
@@ -14996,7 +14994,7 @@
           <w:lang w:val="en"/>
         </w:rPr>
       </w:pPr>
-      <w:bookmarkStart w:id="18" w:name="_Toc235440573"/>
+      <w:bookmarkStart w:id="18" w:name="_Toc235441691"/>
       <w:r>
         <w:rPr>
           <w:rFonts w:ascii="Segoe UI" w:eastAsia="Times New Roman" w:hAnsi="Segoe UI" w:cs="Segoe UI"/>
@@ -15896,6 +15894,7 @@
                 <w:sz w:val="19"/>
                 <w:szCs w:val="19"/>
               </w:rPr>
+              <w:lastRenderedPageBreak/>
               <w:t>User activity/login visibility</w:t>
             </w:r>
           </w:p>
@@ -16131,7 +16130,6 @@
                 <w:sz w:val="19"/>
                 <w:szCs w:val="19"/>
               </w:rPr>
-              <w:lastRenderedPageBreak/>
               <w:t>Soft-delete with archive</w:t>
             </w:r>
           </w:p>
@@ -16341,7 +16339,7 @@
           <w:lang w:val="en"/>
         </w:rPr>
       </w:pPr>
-      <w:bookmarkStart w:id="19" w:name="_Toc235440574"/>
+      <w:bookmarkStart w:id="19" w:name="_Toc235441692"/>
       <w:r>
         <w:rPr>
           <w:rFonts w:ascii="Segoe UI" w:eastAsia="Times New Roman" w:hAnsi="Segoe UI" w:cs="Segoe UI"/>
@@ -16626,13 +16624,12 @@
           <w:lang w:val="en"/>
         </w:rPr>
       </w:pPr>
-      <w:bookmarkStart w:id="20" w:name="_Toc235440575"/>
+      <w:bookmarkStart w:id="20" w:name="_Toc235441693"/>
       <w:r>
         <w:rPr>
           <w:rFonts w:ascii="Segoe UI" w:eastAsia="Times New Roman" w:hAnsi="Segoe UI" w:cs="Segoe UI"/>
           <w:lang w:val="en"/>
         </w:rPr>
-        <w:lastRenderedPageBreak/>
         <w:t>14. AI Capabilities</w:t>
       </w:r>
       <w:bookmarkEnd w:id="20"/>
@@ -16688,7 +16685,7 @@
           <w:lang w:val="en"/>
         </w:rPr>
       </w:pPr>
-      <w:bookmarkStart w:id="21" w:name="_Toc235440576"/>
+      <w:bookmarkStart w:id="21" w:name="_Toc235441694"/>
       <w:r>
         <w:rPr>
           <w:rFonts w:ascii="Segoe UI" w:eastAsia="Times New Roman" w:hAnsi="Segoe UI" w:cs="Segoe UI"/>
@@ -17235,6 +17232,7 @@
                 <w:sz w:val="19"/>
                 <w:szCs w:val="19"/>
               </w:rPr>
+              <w:lastRenderedPageBreak/>
               <w:t>Quiz generation from a URL</w:t>
             </w:r>
           </w:p>
@@ -17797,7 +17795,7 @@
           <w:lang w:val="en"/>
         </w:rPr>
       </w:pPr>
-      <w:bookmarkStart w:id="22" w:name="_Toc235440577"/>
+      <w:bookmarkStart w:id="22" w:name="_Toc235441695"/>
       <w:r>
         <w:rPr>
           <w:rFonts w:ascii="Segoe UI" w:eastAsia="Times New Roman" w:hAnsi="Segoe UI" w:cs="Segoe UI"/>
@@ -17886,7 +17884,6 @@
                 <w:sz w:val="19"/>
                 <w:szCs w:val="19"/>
               </w:rPr>
-              <w:lastRenderedPageBreak/>
               <w:t>Capability</w:t>
             </w:r>
           </w:p>
@@ -18810,12 +18807,13 @@
           <w:lang w:val="en"/>
         </w:rPr>
       </w:pPr>
-      <w:bookmarkStart w:id="23" w:name="_Toc235440578"/>
+      <w:bookmarkStart w:id="23" w:name="_Toc235441696"/>
       <w:r>
         <w:rPr>
           <w:rFonts w:ascii="Segoe UI" w:eastAsia="Times New Roman" w:hAnsi="Segoe UI" w:cs="Segoe UI"/>
           <w:lang w:val="en"/>
         </w:rPr>
+        <w:lastRenderedPageBreak/>
         <w:t>14.3 Future Roadmap</w:t>
       </w:r>
       <w:bookmarkEnd w:id="23"/>
@@ -19268,13 +19266,12 @@
           <w:lang w:val="en"/>
         </w:rPr>
       </w:pPr>
-      <w:bookmarkStart w:id="24" w:name="_Toc235440579"/>
+      <w:bookmarkStart w:id="24" w:name="_Toc235441697"/>
       <w:r>
         <w:rPr>
           <w:rFonts w:ascii="Segoe UI" w:eastAsia="Times New Roman" w:hAnsi="Segoe UI" w:cs="Segoe UI"/>
           <w:lang w:val="en"/>
         </w:rPr>
-        <w:lastRenderedPageBreak/>
         <w:t>15. User Roles</w:t>
       </w:r>
       <w:bookmarkEnd w:id="24"/>
@@ -20073,6 +20070,7 @@
                 <w:sz w:val="19"/>
                 <w:szCs w:val="19"/>
               </w:rPr>
+              <w:lastRenderedPageBreak/>
               <w:t>Auditor</w:t>
             </w:r>
           </w:p>
@@ -20237,13 +20235,12 @@
           <w:lang w:val="en"/>
         </w:rPr>
       </w:pPr>
-      <w:bookmarkStart w:id="25" w:name="_Toc235440580"/>
+      <w:bookmarkStart w:id="25" w:name="_Toc235441698"/>
       <w:r>
         <w:rPr>
           <w:rFonts w:ascii="Segoe UI" w:eastAsia="Times New Roman" w:hAnsi="Segoe UI" w:cs="Segoe UI"/>
           <w:lang w:val="en"/>
         </w:rPr>
-        <w:lastRenderedPageBreak/>
         <w:t>16. Reporting and Analytics</w:t>
       </w:r>
       <w:bookmarkEnd w:id="25"/>
@@ -21630,6 +21627,7 @@
                 <w:sz w:val="19"/>
                 <w:szCs w:val="19"/>
               </w:rPr>
+              <w:lastRenderedPageBreak/>
               <w:t>Export to Excel &amp; CSV</w:t>
             </w:r>
           </w:p>
@@ -21966,7 +21964,6 @@
           <w:szCs w:val="21"/>
           <w:lang w:val="en"/>
         </w:rPr>
-        <w:lastRenderedPageBreak/>
         <w:t xml:space="preserve">All PDF, Excel, and CSV exports are compliance-ready: report headers are rendered in both Arabic and English, so that reports generated for </w:t>
       </w:r>
       <w:r>
@@ -22090,12 +22087,13 @@
     <w:p>
       <w:pPr>
         <w:pStyle w:val="Heading1"/>
+        <w:pageBreakBefore/>
         <w:rPr>
           <w:rFonts w:ascii="Segoe UI" w:eastAsia="Times New Roman" w:hAnsi="Segoe UI" w:cs="Segoe UI"/>
           <w:lang w:val="en"/>
         </w:rPr>
       </w:pPr>
-      <w:bookmarkStart w:id="26" w:name="_Toc235440581"/>
+      <w:bookmarkStart w:id="26" w:name="_Toc235441699"/>
       <w:r>
         <w:rPr>
           <w:rFonts w:ascii="Segoe UI" w:eastAsia="Times New Roman" w:hAnsi="Segoe UI" w:cs="Segoe UI"/>
@@ -22136,7 +22134,7 @@
           <w:lang w:val="en"/>
         </w:rPr>
       </w:pPr>
-      <w:bookmarkStart w:id="27" w:name="_Toc235440582"/>
+      <w:bookmarkStart w:id="27" w:name="_Toc235441700"/>
       <w:r>
         <w:rPr>
           <w:rFonts w:ascii="Segoe UI" w:eastAsia="Times New Roman" w:hAnsi="Segoe UI" w:cs="Segoe UI"/>
@@ -23020,7 +23018,7 @@
           <w:lang w:val="en"/>
         </w:rPr>
       </w:pPr>
-      <w:bookmarkStart w:id="28" w:name="_Toc235440583"/>
+      <w:bookmarkStart w:id="28" w:name="_Toc235441701"/>
       <w:r>
         <w:rPr>
           <w:rFonts w:ascii="Segoe UI" w:eastAsia="Times New Roman" w:hAnsi="Segoe UI" w:cs="Segoe UI"/>
@@ -23922,13 +23920,12 @@
           <w:lang w:val="en"/>
         </w:rPr>
       </w:pPr>
-      <w:bookmarkStart w:id="29" w:name="_Toc235440584"/>
+      <w:bookmarkStart w:id="29" w:name="_Toc235441702"/>
       <w:r>
         <w:rPr>
           <w:rFonts w:ascii="Segoe UI" w:eastAsia="Times New Roman" w:hAnsi="Segoe UI" w:cs="Segoe UI"/>
           <w:lang w:val="en"/>
         </w:rPr>
-        <w:lastRenderedPageBreak/>
         <w:t>18. Real-Time Architecture</w:t>
       </w:r>
       <w:bookmarkEnd w:id="29"/>
@@ -23963,7 +23960,7 @@
           <w:lang w:val="en"/>
         </w:rPr>
       </w:pPr>
-      <w:bookmarkStart w:id="30" w:name="_Toc235440585"/>
+      <w:bookmarkStart w:id="30" w:name="_Toc235441703"/>
       <w:r>
         <w:rPr>
           <w:rFonts w:ascii="Segoe UI" w:eastAsia="Times New Roman" w:hAnsi="Segoe UI" w:cs="Segoe UI"/>
@@ -24503,7 +24500,7 @@
           <w:lang w:val="en"/>
         </w:rPr>
       </w:pPr>
-      <w:bookmarkStart w:id="31" w:name="_Toc235440586"/>
+      <w:bookmarkStart w:id="31" w:name="_Toc235441704"/>
       <w:r>
         <w:rPr>
           <w:rFonts w:ascii="Segoe UI" w:eastAsia="Times New Roman" w:hAnsi="Segoe UI" w:cs="Segoe UI"/>
@@ -24532,7 +24529,7 @@
           <w:szCs w:val="21"/>
           <w:lang w:val="en"/>
         </w:rPr>
-        <w:t>Question timing, closure, and scoring are controlled by the server, not by any individual device: participant and host devices render a countdown, an open or closed question, and an updated leaderboard, but they never decide when a question opens or closes and are never trusted with the correct answer before it is safe to reveal it. Where a participant's device loses connectivity mid-session — common in venues with variable Wi-Fi or mobile coverage — the platform automatically attempts to reconnect the sess</w:t>
+        <w:t xml:space="preserve">Question timing, closure, and scoring are controlled by the server, not by any individual device: participant and host devices render a countdown, an open or closed question, and an updated </w:t>
       </w:r>
       <w:r>
         <w:rPr>
@@ -24542,7 +24539,18 @@
           <w:szCs w:val="21"/>
           <w:lang w:val="en"/>
         </w:rPr>
-        <w:t>ion rather than dropping the participant. For a session of the scale described in Section 24, this combination is what keeps a large, live audience in a fair, synchronized session rather than a collection of individually drifting client experiences.</w:t>
+        <w:lastRenderedPageBreak/>
+        <w:t>leaderboard, but they never decide when a question opens or closes and are never trusted with the correct answer before it is safe to reveal it. Where a participant's device loses connectivity mid-session — common in venues with variable Wi-Fi or mobile coverage — the platform automatically attempts to reconnect the session rather than dropping the participant. For a session of the scale described in Section 24, this combination is what keeps a large, live audience in a fair, synchronized session rather tha</w:t>
+      </w:r>
+      <w:r>
+        <w:rPr>
+          <w:rFonts w:ascii="Segoe UI" w:hAnsi="Segoe UI" w:cs="Segoe UI"/>
+          <w:color w:val="1F2933"/>
+          <w:sz w:val="21"/>
+          <w:szCs w:val="21"/>
+          <w:lang w:val="en"/>
+        </w:rPr>
+        <w:t>n a collection of individually drifting client experiences.</w:t>
       </w:r>
     </w:p>
     <w:p>
@@ -24553,13 +24561,12 @@
           <w:lang w:val="en"/>
         </w:rPr>
       </w:pPr>
-      <w:bookmarkStart w:id="32" w:name="_Toc235440587"/>
+      <w:bookmarkStart w:id="32" w:name="_Toc235441705"/>
       <w:r>
         <w:rPr>
           <w:rFonts w:ascii="Segoe UI" w:eastAsia="Times New Roman" w:hAnsi="Segoe UI" w:cs="Segoe UI"/>
           <w:lang w:val="en"/>
         </w:rPr>
-        <w:lastRenderedPageBreak/>
         <w:t>19. Deployment Options</w:t>
       </w:r>
       <w:bookmarkEnd w:id="32"/>
@@ -25416,7 +25423,7 @@
           <w:lang w:val="en"/>
         </w:rPr>
       </w:pPr>
-      <w:bookmarkStart w:id="33" w:name="_Toc235440588"/>
+      <w:bookmarkStart w:id="33" w:name="_Toc235441706"/>
       <w:r>
         <w:rPr>
           <w:rFonts w:ascii="Segoe UI" w:eastAsia="Times New Roman" w:hAnsi="Segoe UI" w:cs="Segoe UI"/>
@@ -25477,7 +25484,7 @@
           <w:lang w:val="en"/>
         </w:rPr>
       </w:pPr>
-      <w:bookmarkStart w:id="34" w:name="_Toc235440589"/>
+      <w:bookmarkStart w:id="34" w:name="_Toc235441707"/>
       <w:r>
         <w:rPr>
           <w:rFonts w:ascii="Segoe UI" w:eastAsia="Times New Roman" w:hAnsi="Segoe UI" w:cs="Segoe UI"/>
@@ -25638,6 +25645,7 @@
                 <w:sz w:val="19"/>
                 <w:szCs w:val="19"/>
               </w:rPr>
+              <w:lastRenderedPageBreak/>
               <w:t>Client data center</w:t>
             </w:r>
           </w:p>
@@ -25796,7 +25804,6 @@
                 <w:sz w:val="19"/>
                 <w:szCs w:val="19"/>
               </w:rPr>
-              <w:lastRenderedPageBreak/>
               <w:t>Docker containers</w:t>
             </w:r>
           </w:p>
@@ -26035,7 +26042,7 @@
           <w:lang w:val="en"/>
         </w:rPr>
       </w:pPr>
-      <w:bookmarkStart w:id="35" w:name="_Toc235440590"/>
+      <w:bookmarkStart w:id="35" w:name="_Toc235441708"/>
       <w:r>
         <w:rPr>
           <w:rFonts w:ascii="Segoe UI" w:eastAsia="Times New Roman" w:hAnsi="Segoe UI" w:cs="Segoe UI"/>
@@ -26096,13 +26103,12 @@
           <w:lang w:val="en"/>
         </w:rPr>
       </w:pPr>
-      <w:bookmarkStart w:id="36" w:name="_Toc235440591"/>
+      <w:bookmarkStart w:id="36" w:name="_Toc235441709"/>
       <w:r>
         <w:rPr>
           <w:rFonts w:ascii="Segoe UI" w:eastAsia="Times New Roman" w:hAnsi="Segoe UI" w:cs="Segoe UI"/>
           <w:lang w:val="en"/>
         </w:rPr>
-        <w:lastRenderedPageBreak/>
         <w:t>20. Cybersecurity</w:t>
       </w:r>
       <w:bookmarkEnd w:id="36"/>
@@ -26466,6 +26472,7 @@
                 <w:sz w:val="19"/>
                 <w:szCs w:val="19"/>
               </w:rPr>
+              <w:lastRenderedPageBreak/>
               <w:t>3. Application security</w:t>
             </w:r>
           </w:p>
@@ -26934,13 +26941,12 @@
           <w:lang w:val="en"/>
         </w:rPr>
       </w:pPr>
-      <w:bookmarkStart w:id="37" w:name="_Toc235440592"/>
+      <w:bookmarkStart w:id="37" w:name="_Toc235441710"/>
       <w:r>
         <w:rPr>
           <w:rFonts w:ascii="Segoe UI" w:eastAsia="Times New Roman" w:hAnsi="Segoe UI" w:cs="Segoe UI"/>
           <w:lang w:val="en"/>
         </w:rPr>
-        <w:lastRenderedPageBreak/>
         <w:t>21. Data Protection</w:t>
       </w:r>
       <w:bookmarkEnd w:id="37"/>
@@ -26985,7 +26991,7 @@
           <w:szCs w:val="21"/>
           <w:lang w:val="en"/>
         </w:rPr>
-        <w:t xml:space="preserve">'s data is backed up, retained, deleted, and exported. No guarantee of zero downtime or zero data loss is made; the platform is designed to align with sound backup, retention, and recovery practice within the parameters agreed with </w:t>
+        <w:t xml:space="preserve">'s data is backed up, retained, deleted, and exported. Availability and data-durability commitments are not presented as absolutes; they are defined in the agreed SLA, and the platform is designed to align with sound backup, retention, and recovery practice within the parameters agreed with </w:t>
       </w:r>
       <w:r>
         <w:rPr>
@@ -27345,6 +27351,7 @@
                 <w:sz w:val="19"/>
                 <w:szCs w:val="19"/>
               </w:rPr>
+              <w:lastRenderedPageBreak/>
               <w:t>Deletion</w:t>
             </w:r>
           </w:p>
@@ -27593,13 +27600,12 @@
           <w:lang w:val="en"/>
         </w:rPr>
       </w:pPr>
-      <w:bookmarkStart w:id="38" w:name="_Toc235440593"/>
+      <w:bookmarkStart w:id="38" w:name="_Toc235441711"/>
       <w:r>
         <w:rPr>
           <w:rFonts w:ascii="Segoe UI" w:eastAsia="Times New Roman" w:hAnsi="Segoe UI" w:cs="Segoe UI"/>
           <w:lang w:val="en"/>
         </w:rPr>
-        <w:lastRenderedPageBreak/>
         <w:t>22. Data Ownership</w:t>
       </w:r>
       <w:bookmarkEnd w:id="38"/>
@@ -27952,13 +27958,12 @@
           <w:lang w:val="en"/>
         </w:rPr>
       </w:pPr>
-      <w:bookmarkStart w:id="39" w:name="_Toc235440594"/>
+      <w:bookmarkStart w:id="39" w:name="_Toc235441712"/>
       <w:r>
         <w:rPr>
           <w:rFonts w:ascii="Segoe UI" w:eastAsia="Times New Roman" w:hAnsi="Segoe UI" w:cs="Segoe UI"/>
           <w:lang w:val="en"/>
         </w:rPr>
-        <w:lastRenderedPageBreak/>
         <w:t>23. Integration Options</w:t>
       </w:r>
       <w:bookmarkEnd w:id="39"/>
@@ -28308,6 +28313,7 @@
                 <w:sz w:val="19"/>
                 <w:szCs w:val="19"/>
               </w:rPr>
+              <w:lastRenderedPageBreak/>
               <w:t>HR systems</w:t>
             </w:r>
           </w:p>
@@ -28888,13 +28894,12 @@
           <w:lang w:val="en"/>
         </w:rPr>
       </w:pPr>
-      <w:bookmarkStart w:id="40" w:name="_Toc235440595"/>
+      <w:bookmarkStart w:id="40" w:name="_Toc235441713"/>
       <w:r>
         <w:rPr>
           <w:rFonts w:ascii="Segoe UI" w:eastAsia="Times New Roman" w:hAnsi="Segoe UI" w:cs="Segoe UI"/>
           <w:lang w:val="en"/>
         </w:rPr>
-        <w:lastRenderedPageBreak/>
         <w:t>24. Performance and Scalability</w:t>
       </w:r>
       <w:bookmarkEnd w:id="40"/>
@@ -29266,7 +29271,28 @@
           <w:szCs w:val="21"/>
           <w:lang w:val="en"/>
         </w:rPr>
-        <w:t xml:space="preserve">Altanfith Aldwaliah SPC does not make claims of unlimited scalability. Performance at higher concurrency levels than those referenced above should be validated through load testing scoped to </w:t>
+        <w:t xml:space="preserve">Scaling beyond the levels referenced above is planned and validated against concurrency targets confirmed with </w:t>
+      </w:r>
+      <w:r>
+        <w:rPr>
+          <w:rStyle w:val="Strong"/>
+          <w:rFonts w:ascii="Segoe UI" w:hAnsi="Segoe UI" w:cs="Segoe UI"/>
+          <w:color w:val="1F2933"/>
+          <w:sz w:val="21"/>
+          <w:szCs w:val="21"/>
+          <w:lang w:val="en"/>
+        </w:rPr>
+        <w:t>[Client Name]</w:t>
+      </w:r>
+      <w:r>
+        <w:rPr>
+          <w:rFonts w:ascii="Segoe UI" w:hAnsi="Segoe UI" w:cs="Segoe UI"/>
+          <w:color w:val="1F2933"/>
+          <w:sz w:val="21"/>
+          <w:szCs w:val="21"/>
+          <w:lang w:val="en"/>
+        </w:rPr>
+        <w:t xml:space="preserve"> during discovery, rather than presented as an open-ended capability. Performance at higher concurrency levels than those referenced above should be validated through load testing scoped to </w:t>
       </w:r>
       <w:r>
         <w:rPr>
@@ -29340,6 +29366,7 @@
                 <w:sz w:val="22"/>
                 <w:szCs w:val="22"/>
               </w:rPr>
+              <w:lastRenderedPageBreak/>
               <w:t>PART FOUR</w:t>
             </w:r>
           </w:p>
@@ -29389,12 +29416,13 @@
     <w:p>
       <w:pPr>
         <w:pStyle w:val="Heading1"/>
+        <w:pageBreakBefore/>
         <w:rPr>
           <w:rFonts w:ascii="Segoe UI" w:eastAsia="Times New Roman" w:hAnsi="Segoe UI" w:cs="Segoe UI"/>
           <w:lang w:val="en"/>
         </w:rPr>
       </w:pPr>
-      <w:bookmarkStart w:id="41" w:name="_Toc235440596"/>
+      <w:bookmarkStart w:id="41" w:name="_Toc235441714"/>
       <w:r>
         <w:rPr>
           <w:rFonts w:ascii="Segoe UI" w:eastAsia="Times New Roman" w:hAnsi="Segoe UI" w:cs="Segoe UI"/>
@@ -31640,13 +31668,12 @@
           <w:lang w:val="en"/>
         </w:rPr>
       </w:pPr>
-      <w:bookmarkStart w:id="42" w:name="_Toc235440597"/>
+      <w:bookmarkStart w:id="42" w:name="_Toc235441715"/>
       <w:r>
         <w:rPr>
           <w:rFonts w:ascii="Segoe UI" w:eastAsia="Times New Roman" w:hAnsi="Segoe UI" w:cs="Segoe UI"/>
           <w:lang w:val="en"/>
         </w:rPr>
-        <w:lastRenderedPageBreak/>
         <w:t>26. Project Timeline</w:t>
       </w:r>
       <w:bookmarkEnd w:id="42"/>
@@ -32208,6 +32235,7 @@
                 <w:sz w:val="19"/>
                 <w:szCs w:val="19"/>
               </w:rPr>
+              <w:lastRenderedPageBreak/>
               <w:t>W10</w:t>
             </w:r>
           </w:p>
@@ -32339,7 +32367,7 @@
           <w:lang w:val="en"/>
         </w:rPr>
       </w:pPr>
-      <w:bookmarkStart w:id="43" w:name="_Toc235440598"/>
+      <w:bookmarkStart w:id="43" w:name="_Toc235441716"/>
       <w:r>
         <w:rPr>
           <w:rFonts w:ascii="Segoe UI" w:eastAsia="Times New Roman" w:hAnsi="Segoe UI" w:cs="Segoe UI"/>
@@ -33367,7 +33395,6 @@
                 <w:sz w:val="19"/>
                 <w:szCs w:val="19"/>
               </w:rPr>
-              <w:lastRenderedPageBreak/>
               <w:t>M6</w:t>
             </w:r>
           </w:p>
@@ -33697,13 +33724,12 @@
           <w:lang w:val="en"/>
         </w:rPr>
       </w:pPr>
-      <w:bookmarkStart w:id="44" w:name="_Toc235440599"/>
+      <w:bookmarkStart w:id="44" w:name="_Toc235441717"/>
       <w:r>
         <w:rPr>
           <w:rFonts w:ascii="Segoe UI" w:eastAsia="Times New Roman" w:hAnsi="Segoe UI" w:cs="Segoe UI"/>
           <w:lang w:val="en"/>
         </w:rPr>
-        <w:lastRenderedPageBreak/>
         <w:t>27. Project Governance</w:t>
       </w:r>
       <w:bookmarkEnd w:id="44"/>
@@ -33949,6 +33975,7 @@
                 <w:sz w:val="19"/>
                 <w:szCs w:val="19"/>
               </w:rPr>
+              <w:lastRenderedPageBreak/>
               <w:t>Client Project Manager</w:t>
             </w:r>
           </w:p>
@@ -34340,13 +34367,12 @@
           <w:lang w:val="en"/>
         </w:rPr>
       </w:pPr>
-      <w:bookmarkStart w:id="45" w:name="_Toc235440600"/>
+      <w:bookmarkStart w:id="45" w:name="_Toc235441718"/>
       <w:r>
         <w:rPr>
           <w:rFonts w:ascii="Segoe UI" w:eastAsia="Times New Roman" w:hAnsi="Segoe UI" w:cs="Segoe UI"/>
           <w:lang w:val="en"/>
         </w:rPr>
-        <w:lastRenderedPageBreak/>
         <w:t>28. Deliverables</w:t>
       </w:r>
       <w:bookmarkEnd w:id="45"/>
@@ -35145,6 +35171,7 @@
                 <w:sz w:val="19"/>
                 <w:szCs w:val="19"/>
               </w:rPr>
+              <w:lastRenderedPageBreak/>
               <w:t>Deployed Express backend</w:t>
             </w:r>
           </w:p>
@@ -35968,7 +35995,6 @@
                 <w:sz w:val="19"/>
                 <w:szCs w:val="19"/>
               </w:rPr>
-              <w:lastRenderedPageBreak/>
               <w:t>User manual</w:t>
             </w:r>
           </w:p>
@@ -36909,6 +36935,7 @@
                 <w:sz w:val="19"/>
                 <w:szCs w:val="19"/>
               </w:rPr>
+              <w:lastRenderedPageBreak/>
               <w:t>Source code</w:t>
             </w:r>
           </w:p>
@@ -37118,13 +37145,12 @@
           <w:lang w:val="en"/>
         </w:rPr>
       </w:pPr>
-      <w:bookmarkStart w:id="46" w:name="_Toc235440601"/>
+      <w:bookmarkStart w:id="46" w:name="_Toc235441719"/>
       <w:r>
         <w:rPr>
           <w:rFonts w:ascii="Segoe UI" w:eastAsia="Times New Roman" w:hAnsi="Segoe UI" w:cs="Segoe UI"/>
           <w:lang w:val="en"/>
         </w:rPr>
-        <w:lastRenderedPageBreak/>
         <w:t>29. Training and Knowledge Transfer</w:t>
       </w:r>
       <w:bookmarkEnd w:id="46"/>
@@ -38271,13 +38297,12 @@
           <w:lang w:val="en"/>
         </w:rPr>
       </w:pPr>
-      <w:bookmarkStart w:id="47" w:name="_Toc235440602"/>
+      <w:bookmarkStart w:id="47" w:name="_Toc235441720"/>
       <w:r>
         <w:rPr>
           <w:rFonts w:ascii="Segoe UI" w:eastAsia="Times New Roman" w:hAnsi="Segoe UI" w:cs="Segoe UI"/>
           <w:lang w:val="en"/>
         </w:rPr>
-        <w:lastRenderedPageBreak/>
         <w:t>30. Testing and Acceptance</w:t>
       </w:r>
       <w:bookmarkEnd w:id="47"/>
@@ -38301,7 +38326,18 @@
           <w:szCs w:val="21"/>
           <w:lang w:val="en"/>
         </w:rPr>
-        <w:t xml:space="preserve">The platform passes through three layers of testing before it is accepted for production go-live. Altanfith performs internal functional and regression testing (Phase 9) across the configured environment, followed by security-focused testing (Phase 10) against the controls described in Section 20, ahead of client security review and sign-off. User Acceptance Testing (Phase 11) is then carried out against a client-approved UAT plan and agreed acceptance criteria, so that </w:t>
+        <w:t xml:space="preserve">The platform passes through three layers of testing before it is accepted for production go-live. Altanfith performs internal functional and regression testing (Phase 9) across the configured environment, followed by security-focused testing (Phase 10) against the controls described in Section 20, ahead of client security review and sign-off. User Acceptance Testing (Phase 11) is then carried out </w:t>
+      </w:r>
+      <w:r>
+        <w:rPr>
+          <w:rFonts w:ascii="Segoe UI" w:hAnsi="Segoe UI" w:cs="Segoe UI"/>
+          <w:color w:val="1F2933"/>
+          <w:sz w:val="21"/>
+          <w:szCs w:val="21"/>
+          <w:lang w:val="en"/>
+        </w:rPr>
+        <w:lastRenderedPageBreak/>
+        <w:t xml:space="preserve">against a client-approved UAT plan and agreed acceptance criteria, so that </w:t>
       </w:r>
       <w:r>
         <w:rPr>
@@ -38355,13 +38391,12 @@
           <w:lang w:val="en"/>
         </w:rPr>
       </w:pPr>
-      <w:bookmarkStart w:id="48" w:name="_Toc235440603"/>
+      <w:bookmarkStart w:id="48" w:name="_Toc235441721"/>
       <w:r>
         <w:rPr>
           <w:rFonts w:ascii="Segoe UI" w:eastAsia="Times New Roman" w:hAnsi="Segoe UI" w:cs="Segoe UI"/>
           <w:lang w:val="en"/>
         </w:rPr>
-        <w:lastRenderedPageBreak/>
         <w:t>31. Support and Maintenance</w:t>
       </w:r>
       <w:bookmarkEnd w:id="48"/>
@@ -38798,13 +38833,12 @@
           <w:lang w:val="en"/>
         </w:rPr>
       </w:pPr>
-      <w:bookmarkStart w:id="49" w:name="_Toc235440604"/>
+      <w:bookmarkStart w:id="49" w:name="_Toc235441722"/>
       <w:r>
         <w:rPr>
           <w:rFonts w:ascii="Segoe UI" w:eastAsia="Times New Roman" w:hAnsi="Segoe UI" w:cs="Segoe UI"/>
           <w:lang w:val="en"/>
         </w:rPr>
-        <w:lastRenderedPageBreak/>
         <w:t>32. SLA</w:t>
       </w:r>
       <w:bookmarkEnd w:id="49"/>
@@ -39534,6 +39568,7 @@
                 <w:sz w:val="19"/>
                 <w:szCs w:val="19"/>
               </w:rPr>
+              <w:lastRenderedPageBreak/>
               <w:t>4 — Low</w:t>
             </w:r>
           </w:p>
@@ -39868,9 +39903,9 @@
 <file path=word/numbering.xml><?xml version="1.0" encoding="utf-8"?>
 <w:numbering xmlns:wpc="http://schemas.microsoft.com/office/word/2010/wordprocessingCanvas" xmlns:cx="http://schemas.microsoft.com/office/drawing/2014/chartex" xmlns:cx1="http://schemas.microsoft.com/office/drawing/2015/9/8/chartex" xmlns:cx2="http://schemas.microsoft.com/office/drawing/2015/10/21/chartex" xmlns:cx3="http://schemas.microsoft.com/office/drawing/2016/5/9/chartex" xmlns:cx4="http://schemas.microsoft.com/office/drawing/2016/5/10/chartex" xmlns:cx5="http://schemas.microsoft.com/office/drawing/2016/5/11/chartex" xmlns:cx6="http://schemas.microsoft.com/office/drawing/2016/5/12/chartex" xmlns:cx7="http://schemas.microsoft.com/office/drawing/2016/5/13/chartex" xmlns:cx8="http://schemas.microsoft.com/office/drawing/2016/5/14/chartex" xmlns:mc="http://schemas.openxmlformats.org/markup-compatibility/2006" xmlns:aink="http://schemas.microsoft.com/office/drawing/2016/ink" xmlns:am3d="http://schemas.microsoft.com/office/drawing/2017/model3d" xmlns:o="urn:schemas-microsoft-com:office:office" xmlns:oel="http://schemas.microsoft.com/office/2019/extlst" xmlns:r="http://schemas.openxmlformats.org/officeDocument/2006/relationships" xmlns:m="http://schemas.openxmlformats.org/officeDocument/2006/math" xmlns:v="urn:schemas-microsoft-com:vml" xmlns:wp14="http://schemas.microsoft.com/office/word/2010/wordprocessingDrawing" xmlns:wp="http://schemas.openxmlformats.org/drawingml/2006/wordprocessingDrawing" xmlns:w10="urn:schemas-microsoft-com:office:word" xmlns:w="http://schemas.openxmlformats.org/wordprocessingml/2006/main" xmlns:w14="http://schemas.microsoft.com/office/word/2010/wordml" xmlns:w15="http://schemas.microsoft.com/office/word/2012/wordml" xmlns:w16cex="http://schemas.microsoft.com/office/word/2018/wordml/cex" xmlns:w16cid="http://schemas.microsoft.com/office/word/2016/wordml/cid" xmlns:w16="http://schemas.microsoft.com/office/word/2018/wordml" xmlns:w16du="http://schemas.microsoft.com/office/word/2023/wordml/word16du" xmlns:w16sdtdh="http://schemas.microsoft.com/office/word/2020/wordml/sdtdatahash" xmlns:w16sdtfl="http://schemas.microsoft.com/office/word/2024/wordml/sdtformatlock" xmlns:w16se="http://schemas.microsoft.com/office/word/2015/wordml/symex" xmlns:wpg="http://schemas.microsoft.com/office/word/2010/wordprocessingGroup" xmlns:wpi="http://schemas.microsoft.com/office/word/2010/wordprocessingInk" xmlns:wne="http://schemas.microsoft.com/office/word/2006/wordml" xmlns:wps="http://schemas.microsoft.com/office/word/2010/wordprocessingShape" mc:Ignorable="w14 w15 w16se w16cid w16 w16cex w16sdtdh w16sdtfl w16du wp14">
   <w:abstractNum w:abstractNumId="0" w15:restartNumberingAfterBreak="0">
-    <w:nsid w:val="1129012B"/>
+    <w:nsid w:val="1B385977"/>
     <w:multiLevelType w:val="multilevel"/>
-    <w:tmpl w:val="828246AE"/>
+    <w:tmpl w:val="05EC80FE"/>
     <w:lvl w:ilvl="0">
       <w:start w:val="1"/>
       <w:numFmt w:val="bullet"/>
@@ -40017,9 +40052,9 @@
     </w:lvl>
   </w:abstractNum>
   <w:abstractNum w:abstractNumId="1" w15:restartNumberingAfterBreak="0">
-    <w:nsid w:val="72130CF6"/>
+    <w:nsid w:val="7E92725E"/>
     <w:multiLevelType w:val="multilevel"/>
-    <w:tmpl w:val="E4900932"/>
+    <w:tmpl w:val="A3C0A7A6"/>
     <w:lvl w:ilvl="0">
       <w:start w:val="1"/>
       <w:numFmt w:val="bullet"/>
@@ -40165,11 +40200,11 @@
       </w:rPr>
     </w:lvl>
   </w:abstractNum>
-  <w:num w:numId="1" w16cid:durableId="2130467994">
+  <w:num w:numId="1" w16cid:durableId="2051951525">
+    <w:abstractNumId w:val="1"/>
+  </w:num>
+  <w:num w:numId="2" w16cid:durableId="249200434">
     <w:abstractNumId w:val="0"/>
-  </w:num>
-  <w:num w:numId="2" w16cid:durableId="89351065">
-    <w:abstractNumId w:val="1"/>
   </w:num>
 </w:numbering>
 </file>
@@ -40579,11 +40614,11 @@
     <w:uiPriority w:val="9"/>
     <w:qFormat/>
     <w:pPr>
-      <w:pageBreakBefore/>
+      <w:keepNext/>
       <w:pBdr>
         <w:bottom w:val="single" w:sz="18" w:space="4" w:color="0FA3A3"/>
       </w:pBdr>
-      <w:spacing w:before="100" w:beforeAutospacing="1" w:after="100" w:afterAutospacing="1"/>
+      <w:spacing w:before="400" w:after="100" w:afterAutospacing="1"/>
       <w:outlineLvl w:val="0"/>
     </w:pPr>
     <w:rPr>
@@ -40717,6 +40752,7 @@
     <w:name w:val="pb"/>
     <w:basedOn w:val="Normal"/>
     <w:pPr>
+      <w:pageBreakBefore/>
       <w:spacing w:before="100" w:beforeAutospacing="1" w:after="100" w:afterAutospacing="1"/>
     </w:pPr>
   </w:style>
@@ -40853,7 +40889,7 @@
     <w:link w:val="HeaderChar"/>
     <w:uiPriority w:val="99"/>
     <w:unhideWhenUsed/>
-    <w:rsid w:val="00B7190A"/>
+    <w:rsid w:val="0005785F"/>
     <w:pPr>
       <w:tabs>
         <w:tab w:val="center" w:pos="4680"/>
@@ -40866,7 +40902,7 @@
     <w:basedOn w:val="DefaultParagraphFont"/>
     <w:link w:val="Header"/>
     <w:uiPriority w:val="99"/>
-    <w:rsid w:val="00B7190A"/>
+    <w:rsid w:val="0005785F"/>
     <w:rPr>
       <w:rFonts w:eastAsiaTheme="minorEastAsia"/>
       <w:sz w:val="24"/>
@@ -40879,7 +40915,7 @@
     <w:link w:val="FooterChar"/>
     <w:uiPriority w:val="99"/>
     <w:unhideWhenUsed/>
-    <w:rsid w:val="00B7190A"/>
+    <w:rsid w:val="0005785F"/>
     <w:pPr>
       <w:tabs>
         <w:tab w:val="center" w:pos="4680"/>
@@ -40892,7 +40928,7 @@
     <w:basedOn w:val="DefaultParagraphFont"/>
     <w:link w:val="Footer"/>
     <w:uiPriority w:val="99"/>
-    <w:rsid w:val="00B7190A"/>
+    <w:rsid w:val="0005785F"/>
     <w:rPr>
       <w:rFonts w:eastAsiaTheme="minorEastAsia"/>
       <w:sz w:val="24"/>
@@ -40906,7 +40942,7 @@
     <w:autoRedefine/>
     <w:uiPriority w:val="39"/>
     <w:unhideWhenUsed/>
-    <w:rsid w:val="00B7190A"/>
+    <w:rsid w:val="0005785F"/>
     <w:pPr>
       <w:spacing w:after="100"/>
     </w:pPr>
@@ -40918,7 +40954,7 @@
     <w:autoRedefine/>
     <w:uiPriority w:val="39"/>
     <w:unhideWhenUsed/>
-    <w:rsid w:val="00B7190A"/>
+    <w:rsid w:val="0005785F"/>
     <w:pPr>
       <w:spacing w:after="100"/>
       <w:ind w:left="240"/>

</xml_diff>